<commit_message>
Catalog R3: add radial and axial strain profiles (8-panel Part 2)
Part 2 of every study now shows 8 radial-profile panels at final time:
T*, eps_rr, eps_theta, eps_zz (top) / u*, sig_rr, sig_theta, sig_zz.
eps_rr and eps_theta are exact-final (from U_all); eps_zz is from the
last stored snapshot (~final). R2 kept frozen; new scripts R3/R3_color.

- claude_catalog_R3.m / _R3_color.m (new revision, R2 unchanged)
- figures_catalog{,_color}: all prof now 2x4; hist unchanged (re-rendered)
- FIGURE_CATALOG_FA / _color_FA .md+.docx: 8-panel legend, rebuilt
- REVISIONS.md: catalog row -> R3
</commit_message>
<xml_diff>
--- a/claude/FIGURE_CATALOG_FA.docx
+++ b/claude/FIGURE_CATALOG_FA.docx
@@ -228,19 +228,19 @@
           <w:bCs/>
           <w:rtl/>
         </w:rPr>
-        <w:t xml:space="preserve">بخش ۲ — پروفیل‌های شعاعی (زمان نهایی):</w:t>
-      </w:r>
-      <w:r>
-        <w:rPr>
-          <w:rtl/>
-        </w:rPr>
-        <w:t xml:space="preserve"> </w:t>
-      </w:r>
-      <w:r>
-        <w:rPr>
-          <w:rtl/>
-        </w:rPr>
-        <w:t xml:space="preserve">(۴) دمای</w:t>
+        <w:t xml:space="preserve">بخش ۲ — پروفیل‌های شعاعی در زمان نهایی (۸ پنل):</w:t>
+      </w:r>
+      <w:r>
+        <w:rPr>
+          <w:rtl/>
+        </w:rPr>
+        <w:t xml:space="preserve"> </w:t>
+      </w:r>
+      <w:r>
+        <w:rPr>
+          <w:rtl/>
+        </w:rPr>
+        <w:t xml:space="preserve">دمای</w:t>
       </w:r>
       <w:r>
         <w:rPr>
@@ -290,7 +290,181 @@
         <w:rPr>
           <w:rtl/>
         </w:rPr>
-        <w:t xml:space="preserve">· (۵) جابجایی</w:t>
+        <w:t xml:space="preserve">· کرنش</w:t>
+      </w:r>
+      <w:r>
+        <w:rPr>
+          <w:rtl/>
+        </w:rPr>
+        <w:t xml:space="preserve"> </w:t>
+      </w:r>
+      <w:r>
+        <w:rPr>
+          <w:rtl/>
+        </w:rPr>
+        <w:t xml:space="preserve">شعاعی</w:t>
+      </w:r>
+      <w:r>
+        <w:rPr>
+          <w:rtl/>
+        </w:rPr>
+        <w:t xml:space="preserve"> </w:t>
+      </w:r>
+      <m:oMath>
+        <m:sSub>
+          <m:e>
+            <m:r>
+              <m:t>ϵ</m:t>
+            </m:r>
+          </m:e>
+          <m:sub>
+            <m:r>
+              <m:t>r</m:t>
+            </m:r>
+            <m:r>
+              <m:t>r</m:t>
+            </m:r>
+          </m:sub>
+        </m:sSub>
+        <m:r>
+          <m:rPr>
+            <m:sty m:val="p"/>
+          </m:rPr>
+          <m:t>(</m:t>
+        </m:r>
+        <m:r>
+          <m:t>ξ</m:t>
+        </m:r>
+        <m:r>
+          <m:rPr>
+            <m:sty m:val="p"/>
+          </m:rPr>
+          <m:t>)</m:t>
+        </m:r>
+      </m:oMath>
+      <w:r>
+        <w:rPr>
+          <w:rtl/>
+        </w:rPr>
+        <w:t xml:space="preserve"> </w:t>
+      </w:r>
+      <w:r>
+        <w:rPr>
+          <w:rtl/>
+        </w:rPr>
+        <w:t xml:space="preserve">· کرنش محیطی</w:t>
+      </w:r>
+      <w:r>
+        <w:rPr>
+          <w:rtl/>
+        </w:rPr>
+        <w:t xml:space="preserve"> </w:t>
+      </w:r>
+      <m:oMath>
+        <m:sSub>
+          <m:e>
+            <m:r>
+              <m:t>ϵ</m:t>
+            </m:r>
+          </m:e>
+          <m:sub>
+            <m:r>
+              <m:t>θ</m:t>
+            </m:r>
+            <m:r>
+              <m:t>θ</m:t>
+            </m:r>
+          </m:sub>
+        </m:sSub>
+        <m:r>
+          <m:rPr>
+            <m:sty m:val="p"/>
+          </m:rPr>
+          <m:t>(</m:t>
+        </m:r>
+        <m:r>
+          <m:t>ξ</m:t>
+        </m:r>
+        <m:r>
+          <m:rPr>
+            <m:sty m:val="p"/>
+          </m:rPr>
+          <m:t>)</m:t>
+        </m:r>
+      </m:oMath>
+      <w:r>
+        <w:rPr>
+          <w:rtl/>
+        </w:rPr>
+        <w:t xml:space="preserve"> </w:t>
+      </w:r>
+      <w:r>
+        <w:rPr>
+          <w:rtl/>
+        </w:rPr>
+        <w:t xml:space="preserve">· کرنش</w:t>
+      </w:r>
+      <w:r>
+        <w:rPr>
+          <w:rtl/>
+        </w:rPr>
+        <w:t xml:space="preserve"> </w:t>
+      </w:r>
+      <w:r>
+        <w:rPr>
+          <w:rtl/>
+        </w:rPr>
+        <w:t xml:space="preserve">محوری</w:t>
+      </w:r>
+      <w:r>
+        <w:rPr>
+          <w:rtl/>
+        </w:rPr>
+        <w:t xml:space="preserve"> </w:t>
+      </w:r>
+      <m:oMath>
+        <m:sSub>
+          <m:e>
+            <m:r>
+              <m:t>ϵ</m:t>
+            </m:r>
+          </m:e>
+          <m:sub>
+            <m:r>
+              <m:t>z</m:t>
+            </m:r>
+            <m:r>
+              <m:t>z</m:t>
+            </m:r>
+          </m:sub>
+        </m:sSub>
+        <m:r>
+          <m:rPr>
+            <m:sty m:val="p"/>
+          </m:rPr>
+          <m:t>(</m:t>
+        </m:r>
+        <m:r>
+          <m:t>ξ</m:t>
+        </m:r>
+        <m:r>
+          <m:rPr>
+            <m:sty m:val="p"/>
+          </m:rPr>
+          <m:t>)</m:t>
+        </m:r>
+      </m:oMath>
+      <w:r>
+        <w:rPr>
+          <w:rtl/>
+        </w:rPr>
+        <w:t xml:space="preserve"> </w:t>
+      </w:r>
+      <w:r>
+        <w:rPr>
+          <w:rtl/>
+        </w:rPr>
+        <w:t xml:space="preserve">· جابجایی</w:t>
       </w:r>
       <w:r>
         <w:rPr>
@@ -340,57 +514,7 @@
         <w:rPr>
           <w:rtl/>
         </w:rPr>
-        <w:t xml:space="preserve">· (۶) کرنش محیطی</w:t>
-      </w:r>
-      <w:r>
-        <w:rPr>
-          <w:rtl/>
-        </w:rPr>
-        <w:t xml:space="preserve"> </w:t>
-      </w:r>
-      <m:oMath>
-        <m:sSub>
-          <m:e>
-            <m:r>
-              <m:t>ϵ</m:t>
-            </m:r>
-          </m:e>
-          <m:sub>
-            <m:r>
-              <m:t>θ</m:t>
-            </m:r>
-            <m:r>
-              <m:t>θ</m:t>
-            </m:r>
-          </m:sub>
-        </m:sSub>
-        <m:r>
-          <m:rPr>
-            <m:sty m:val="p"/>
-          </m:rPr>
-          <m:t>(</m:t>
-        </m:r>
-        <m:r>
-          <m:t>ξ</m:t>
-        </m:r>
-        <m:r>
-          <m:rPr>
-            <m:sty m:val="p"/>
-          </m:rPr>
-          <m:t>)</m:t>
-        </m:r>
-      </m:oMath>
-      <w:r>
-        <w:rPr>
-          <w:rtl/>
-        </w:rPr>
-        <w:t xml:space="preserve"> </w:t>
-      </w:r>
-      <w:r>
-        <w:rPr>
-          <w:rtl/>
-        </w:rPr>
-        <w:t xml:space="preserve">· (۷)</w:t>
+        <w:t xml:space="preserve">· تنش شعاعی</w:t>
       </w:r>
       <w:r>
         <w:rPr>
@@ -448,7 +572,7 @@
         <w:rPr>
           <w:rtl/>
         </w:rPr>
-        <w:t xml:space="preserve">· (۸)</w:t>
+        <w:t xml:space="preserve">· تنش محیطی</w:t>
       </w:r>
       <w:r>
         <w:rPr>
@@ -506,7 +630,7 @@
         <w:rPr>
           <w:rtl/>
         </w:rPr>
-        <w:t xml:space="preserve">· (۹)</w:t>
+        <w:t xml:space="preserve">· تنش محوری</w:t>
       </w:r>
       <w:r>
         <w:rPr>
@@ -554,6 +678,59 @@
           <m:t>)</m:t>
         </m:r>
       </m:oMath>
+      <w:r>
+        <w:rPr>
+          <w:rtl/>
+        </w:rPr>
+        <w:t xml:space="preserve">. (کرنش شعاعی و محیطی در زمان نهاییِ دقیق‌اند؛ کرنش محوری</w:t>
+      </w:r>
+      <w:r>
+        <w:rPr>
+          <w:rtl/>
+        </w:rPr>
+        <w:t xml:space="preserve"> </w:t>
+      </w:r>
+      <m:oMath>
+        <m:sSub>
+          <m:e>
+            <m:r>
+              <m:t>ϵ</m:t>
+            </m:r>
+          </m:e>
+          <m:sub>
+            <m:r>
+              <m:t>z</m:t>
+            </m:r>
+            <m:r>
+              <m:t>z</m:t>
+            </m:r>
+          </m:sub>
+        </m:sSub>
+      </m:oMath>
+      <w:r>
+        <w:rPr>
+          <w:rtl/>
+        </w:rPr>
+        <w:t xml:space="preserve"> </w:t>
+      </w:r>
+      <w:r>
+        <w:rPr>
+          <w:rtl/>
+        </w:rPr>
+        <w:t xml:space="preserve">از آخرین لحظهٔ ذخیره‌شده ≈ زمان نهایی محاسبه شده — برای زمان</w:t>
+      </w:r>
+      <w:r>
+        <w:rPr>
+          <w:rtl/>
+        </w:rPr>
+        <w:t xml:space="preserve"> </w:t>
+      </w:r>
+      <w:r>
+        <w:rPr>
+          <w:rtl/>
+        </w:rPr>
+        <w:t xml:space="preserve">نهاییِ دقیق آن، اجرای مجدد با ذخیرهٔ تاریخچهٔ کامل لازم است.)</w:t>
+      </w:r>
     </w:p>
     <w:p>
       <w:pPr>
@@ -754,7 +931,7 @@
       <w:r>
         <w:drawing>
           <wp:inline>
-            <wp:extent cx="5334000" cy="2635146"/>
+            <wp:extent cx="5334000" cy="2443959"/>
             <wp:effectExtent b="0" l="0" r="0" t="0"/>
             <wp:docPr descr="A_prof" title="" id="13" name="Picture"/>
             <a:graphic>
@@ -775,7 +952,7 @@
                   <pic:spPr bwMode="auto">
                     <a:xfrm>
                       <a:off x="0" y="0"/>
-                      <a:ext cx="5334000" cy="2635146"/>
+                      <a:ext cx="5334000" cy="2443959"/>
                     </a:xfrm>
                     <a:prstGeom prst="rect">
                       <a:avLst/>
@@ -863,7 +1040,7 @@
       <w:r>
         <w:drawing>
           <wp:inline>
-            <wp:extent cx="5334000" cy="2982638"/>
+            <wp:extent cx="5334000" cy="2443959"/>
             <wp:effectExtent b="0" l="0" r="0" t="0"/>
             <wp:docPr descr="B_prof" title="" id="20" name="Picture"/>
             <a:graphic>
@@ -884,7 +1061,7 @@
                   <pic:spPr bwMode="auto">
                     <a:xfrm>
                       <a:off x="0" y="0"/>
-                      <a:ext cx="5334000" cy="2982638"/>
+                      <a:ext cx="5334000" cy="2443959"/>
                     </a:xfrm>
                     <a:prstGeom prst="rect">
                       <a:avLst/>
@@ -972,7 +1149,7 @@
       <w:r>
         <w:drawing>
           <wp:inline>
-            <wp:extent cx="5334000" cy="2635146"/>
+            <wp:extent cx="5334000" cy="2443959"/>
             <wp:effectExtent b="0" l="0" r="0" t="0"/>
             <wp:docPr descr="E_prof" title="" id="27" name="Picture"/>
             <a:graphic>
@@ -993,7 +1170,7 @@
                   <pic:spPr bwMode="auto">
                     <a:xfrm>
                       <a:off x="0" y="0"/>
-                      <a:ext cx="5334000" cy="2635146"/>
+                      <a:ext cx="5334000" cy="2443959"/>
                     </a:xfrm>
                     <a:prstGeom prst="rect">
                       <a:avLst/>
@@ -1081,7 +1258,7 @@
       <w:r>
         <w:drawing>
           <wp:inline>
-            <wp:extent cx="5334000" cy="2982638"/>
+            <wp:extent cx="5334000" cy="2443959"/>
             <wp:effectExtent b="0" l="0" r="0" t="0"/>
             <wp:docPr descr="D_prof" title="" id="34" name="Picture"/>
             <a:graphic>
@@ -1102,7 +1279,7 @@
                   <pic:spPr bwMode="auto">
                     <a:xfrm>
                       <a:off x="0" y="0"/>
-                      <a:ext cx="5334000" cy="2982638"/>
+                      <a:ext cx="5334000" cy="2443959"/>
                     </a:xfrm>
                     <a:prstGeom prst="rect">
                       <a:avLst/>
@@ -1190,7 +1367,7 @@
       <w:r>
         <w:drawing>
           <wp:inline>
-            <wp:extent cx="5334000" cy="2635146"/>
+            <wp:extent cx="5334000" cy="2481564"/>
             <wp:effectExtent b="0" l="0" r="0" t="0"/>
             <wp:docPr descr="D2_prof" title="" id="41" name="Picture"/>
             <a:graphic>
@@ -1211,7 +1388,7 @@
                   <pic:spPr bwMode="auto">
                     <a:xfrm>
                       <a:off x="0" y="0"/>
-                      <a:ext cx="5334000" cy="2635146"/>
+                      <a:ext cx="5334000" cy="2481564"/>
                     </a:xfrm>
                     <a:prstGeom prst="rect">
                       <a:avLst/>
@@ -1299,7 +1476,7 @@
       <w:r>
         <w:drawing>
           <wp:inline>
-            <wp:extent cx="5334000" cy="2982638"/>
+            <wp:extent cx="5334000" cy="2443959"/>
             <wp:effectExtent b="0" l="0" r="0" t="0"/>
             <wp:docPr descr="O_prof" title="" id="48" name="Picture"/>
             <a:graphic>
@@ -1320,7 +1497,7 @@
                   <pic:spPr bwMode="auto">
                     <a:xfrm>
                       <a:off x="0" y="0"/>
-                      <a:ext cx="5334000" cy="2982638"/>
+                      <a:ext cx="5334000" cy="2443959"/>
                     </a:xfrm>
                     <a:prstGeom prst="rect">
                       <a:avLst/>
@@ -1408,7 +1585,7 @@
       <w:r>
         <w:drawing>
           <wp:inline>
-            <wp:extent cx="5334000" cy="2982638"/>
+            <wp:extent cx="5334000" cy="2481564"/>
             <wp:effectExtent b="0" l="0" r="0" t="0"/>
             <wp:docPr descr="P_prof" title="" id="55" name="Picture"/>
             <a:graphic>
@@ -1429,7 +1606,7 @@
                   <pic:spPr bwMode="auto">
                     <a:xfrm>
                       <a:off x="0" y="0"/>
-                      <a:ext cx="5334000" cy="2982638"/>
+                      <a:ext cx="5334000" cy="2481564"/>
                     </a:xfrm>
                     <a:prstGeom prst="rect">
                       <a:avLst/>
@@ -1517,7 +1694,7 @@
       <w:r>
         <w:drawing>
           <wp:inline>
-            <wp:extent cx="5334000" cy="2982638"/>
+            <wp:extent cx="5334000" cy="2443959"/>
             <wp:effectExtent b="0" l="0" r="0" t="0"/>
             <wp:docPr descr="C_prof" title="" id="62" name="Picture"/>
             <a:graphic>
@@ -1538,7 +1715,7 @@
                   <pic:spPr bwMode="auto">
                     <a:xfrm>
                       <a:off x="0" y="0"/>
-                      <a:ext cx="5334000" cy="2982638"/>
+                      <a:ext cx="5334000" cy="2443959"/>
                     </a:xfrm>
                     <a:prstGeom prst="rect">
                       <a:avLst/>
@@ -1626,7 +1803,7 @@
       <w:r>
         <w:drawing>
           <wp:inline>
-            <wp:extent cx="5334000" cy="2982638"/>
+            <wp:extent cx="5334000" cy="2481564"/>
             <wp:effectExtent b="0" l="0" r="0" t="0"/>
             <wp:docPr descr="F_prof" title="" id="69" name="Picture"/>
             <a:graphic>
@@ -1647,7 +1824,7 @@
                   <pic:spPr bwMode="auto">
                     <a:xfrm>
                       <a:off x="0" y="0"/>
-                      <a:ext cx="5334000" cy="2982638"/>
+                      <a:ext cx="5334000" cy="2481564"/>
                     </a:xfrm>
                     <a:prstGeom prst="rect">
                       <a:avLst/>
@@ -1735,7 +1912,7 @@
       <w:r>
         <w:drawing>
           <wp:inline>
-            <wp:extent cx="5334000" cy="2982638"/>
+            <wp:extent cx="5334000" cy="2443959"/>
             <wp:effectExtent b="0" l="0" r="0" t="0"/>
             <wp:docPr descr="G_prof" title="" id="76" name="Picture"/>
             <a:graphic>
@@ -1756,7 +1933,7 @@
                   <pic:spPr bwMode="auto">
                     <a:xfrm>
                       <a:off x="0" y="0"/>
-                      <a:ext cx="5334000" cy="2982638"/>
+                      <a:ext cx="5334000" cy="2443959"/>
                     </a:xfrm>
                     <a:prstGeom prst="rect">
                       <a:avLst/>
@@ -1844,7 +2021,7 @@
       <w:r>
         <w:drawing>
           <wp:inline>
-            <wp:extent cx="5334000" cy="2982638"/>
+            <wp:extent cx="5334000" cy="2443959"/>
             <wp:effectExtent b="0" l="0" r="0" t="0"/>
             <wp:docPr descr="N_prof" title="" id="83" name="Picture"/>
             <a:graphic>
@@ -1865,7 +2042,7 @@
                   <pic:spPr bwMode="auto">
                     <a:xfrm>
                       <a:off x="0" y="0"/>
-                      <a:ext cx="5334000" cy="2982638"/>
+                      <a:ext cx="5334000" cy="2443959"/>
                     </a:xfrm>
                     <a:prstGeom prst="rect">
                       <a:avLst/>
@@ -1953,7 +2130,7 @@
       <w:r>
         <w:drawing>
           <wp:inline>
-            <wp:extent cx="5334000" cy="2635146"/>
+            <wp:extent cx="5334000" cy="2481564"/>
             <wp:effectExtent b="0" l="0" r="0" t="0"/>
             <wp:docPr descr="Q_prof" title="" id="90" name="Picture"/>
             <a:graphic>
@@ -1974,7 +2151,7 @@
                   <pic:spPr bwMode="auto">
                     <a:xfrm>
                       <a:off x="0" y="0"/>
-                      <a:ext cx="5334000" cy="2635146"/>
+                      <a:ext cx="5334000" cy="2481564"/>
                     </a:xfrm>
                     <a:prstGeom prst="rect">
                       <a:avLst/>
@@ -2062,7 +2239,7 @@
       <w:r>
         <w:drawing>
           <wp:inline>
-            <wp:extent cx="5334000" cy="2982638"/>
+            <wp:extent cx="5334000" cy="2443959"/>
             <wp:effectExtent b="0" l="0" r="0" t="0"/>
             <wp:docPr descr="H_prof" title="" id="97" name="Picture"/>
             <a:graphic>
@@ -2083,7 +2260,7 @@
                   <pic:spPr bwMode="auto">
                     <a:xfrm>
                       <a:off x="0" y="0"/>
-                      <a:ext cx="5334000" cy="2982638"/>
+                      <a:ext cx="5334000" cy="2443959"/>
                     </a:xfrm>
                     <a:prstGeom prst="rect">
                       <a:avLst/>
@@ -2171,7 +2348,7 @@
       <w:r>
         <w:drawing>
           <wp:inline>
-            <wp:extent cx="5334000" cy="2982638"/>
+            <wp:extent cx="5334000" cy="2443959"/>
             <wp:effectExtent b="0" l="0" r="0" t="0"/>
             <wp:docPr descr="I_prof" title="" id="104" name="Picture"/>
             <a:graphic>
@@ -2192,7 +2369,7 @@
                   <pic:spPr bwMode="auto">
                     <a:xfrm>
                       <a:off x="0" y="0"/>
-                      <a:ext cx="5334000" cy="2982638"/>
+                      <a:ext cx="5334000" cy="2443959"/>
                     </a:xfrm>
                     <a:prstGeom prst="rect">
                       <a:avLst/>
@@ -2280,7 +2457,7 @@
       <w:r>
         <w:drawing>
           <wp:inline>
-            <wp:extent cx="5334000" cy="2635146"/>
+            <wp:extent cx="5334000" cy="2443959"/>
             <wp:effectExtent b="0" l="0" r="0" t="0"/>
             <wp:docPr descr="J_prof" title="" id="111" name="Picture"/>
             <a:graphic>
@@ -2301,7 +2478,7 @@
                   <pic:spPr bwMode="auto">
                     <a:xfrm>
                       <a:off x="0" y="0"/>
-                      <a:ext cx="5334000" cy="2635146"/>
+                      <a:ext cx="5334000" cy="2443959"/>
                     </a:xfrm>
                     <a:prstGeom prst="rect">
                       <a:avLst/>
@@ -2389,7 +2566,7 @@
       <w:r>
         <w:drawing>
           <wp:inline>
-            <wp:extent cx="5334000" cy="2982638"/>
+            <wp:extent cx="5334000" cy="2443959"/>
             <wp:effectExtent b="0" l="0" r="0" t="0"/>
             <wp:docPr descr="K_prof" title="" id="118" name="Picture"/>
             <a:graphic>
@@ -2410,7 +2587,7 @@
                   <pic:spPr bwMode="auto">
                     <a:xfrm>
                       <a:off x="0" y="0"/>
-                      <a:ext cx="5334000" cy="2982638"/>
+                      <a:ext cx="5334000" cy="2443959"/>
                     </a:xfrm>
                     <a:prstGeom prst="rect">
                       <a:avLst/>
@@ -2498,7 +2675,7 @@
       <w:r>
         <w:drawing>
           <wp:inline>
-            <wp:extent cx="5334000" cy="2982638"/>
+            <wp:extent cx="5334000" cy="2443959"/>
             <wp:effectExtent b="0" l="0" r="0" t="0"/>
             <wp:docPr descr="L_prof" title="" id="125" name="Picture"/>
             <a:graphic>
@@ -2519,7 +2696,7 @@
                   <pic:spPr bwMode="auto">
                     <a:xfrm>
                       <a:off x="0" y="0"/>
-                      <a:ext cx="5334000" cy="2982638"/>
+                      <a:ext cx="5334000" cy="2443959"/>
                     </a:xfrm>
                     <a:prstGeom prst="rect">
                       <a:avLst/>
@@ -2607,7 +2784,7 @@
       <w:r>
         <w:drawing>
           <wp:inline>
-            <wp:extent cx="5334000" cy="2635146"/>
+            <wp:extent cx="5334000" cy="2443959"/>
             <wp:effectExtent b="0" l="0" r="0" t="0"/>
             <wp:docPr descr="M_prof" title="" id="132" name="Picture"/>
             <a:graphic>
@@ -2628,7 +2805,7 @@
                   <pic:spPr bwMode="auto">
                     <a:xfrm>
                       <a:off x="0" y="0"/>
-                      <a:ext cx="5334000" cy="2635146"/>
+                      <a:ext cx="5334000" cy="2443959"/>
                     </a:xfrm>
                     <a:prstGeom prst="rect">
                       <a:avLst/>
@@ -2716,7 +2893,7 @@
       <w:r>
         <w:drawing>
           <wp:inline>
-            <wp:extent cx="5334000" cy="2982638"/>
+            <wp:extent cx="5334000" cy="2443959"/>
             <wp:effectExtent b="0" l="0" r="0" t="0"/>
             <wp:docPr descr="T3_prof" title="" id="139" name="Picture"/>
             <a:graphic>
@@ -2737,7 +2914,7 @@
                   <pic:spPr bwMode="auto">
                     <a:xfrm>
                       <a:off x="0" y="0"/>
-                      <a:ext cx="5334000" cy="2982638"/>
+                      <a:ext cx="5334000" cy="2443959"/>
                     </a:xfrm>
                     <a:prstGeom prst="rect">
                       <a:avLst/>

</xml_diff>